<commit_message>
docs(ranking): update the ranking report
</commit_message>
<xml_diff>
--- a/docs/Ranking de Términos Mediante Algoritmos de Ordenamiento no Comparativos.docx
+++ b/docs/Ranking de Términos Mediante Algoritmos de Ordenamiento no Comparativos.docx
@@ -214,7 +214,15 @@
           <w:bCs/>
           <w:lang w:val="es-CO"/>
         </w:rPr>
-        <w:t>1092454006</w:t>
+        <w:t>109245400</w:t>
+      </w:r>
+      <w:r>
+        <w:rPr>
+          <w:b/>
+          <w:bCs/>
+          <w:lang w:val="es-CO"/>
+        </w:rPr>
+        <w:t>7</w:t>
       </w:r>
       <w:r>
         <w:rPr>
@@ -282,7 +290,7 @@
           <w:szCs w:val="24"/>
         </w:rPr>
         <w:drawing>
-          <wp:inline distT="0" distB="0" distL="0" distR="0" wp14:anchorId="1CA7FB33" wp14:editId="3B1BA2C1">
+          <wp:inline distT="0" distB="0" distL="0" distR="0" wp14:anchorId="1CA7FB33" wp14:editId="77D800A7">
             <wp:extent cx="1364400" cy="1540800"/>
             <wp:effectExtent l="0" t="0" r="0" b="2540"/>
             <wp:docPr id="2" name="Imagen 2" descr="Universidad del Quindío"/>
@@ -2268,6 +2276,7 @@
           <w:iCs/>
           <w:lang w:val="es-CO"/>
         </w:rPr>
+        <w:lastRenderedPageBreak/>
         <w:t>n</w:t>
       </w:r>
       <w:r>
@@ -3417,6 +3426,7 @@
         <w:rPr>
           <w:lang w:val="es-CO"/>
         </w:rPr>
+        <w:lastRenderedPageBreak/>
         <w:t>Radix Sort</w:t>
       </w:r>
       <w:bookmarkEnd w:id="8"/>
@@ -4772,7 +4782,15 @@
           <w:rFonts w:asciiTheme="minorHAnsi" w:hAnsiTheme="minorHAnsi" w:cstheme="minorHAnsi"/>
           <w:lang w:val="es-CO"/>
         </w:rPr>
-        <w:t>La versión de libro de texto de Bucket Sort reparte claves distribuidas de manera uniforme en intervalos y ordena cada intervalo con inserción, que es un ordenamiento por comparación; su tiempo esperado lineal descansa precisamente en esa uniformidad (Cormen et al., 2022). Esa variante no sirve para este requerimiento, ya que introduciría comparaciones entre registros dentro de cada intervalo. La implementación es, por ello, una variante híbrida</w:t>
+        <w:t xml:space="preserve">La versión de libro de texto de Bucket Sort reparte claves distribuidas de manera uniforme en intervalos y ordena cada intervalo con inserción, que es un ordenamiento por comparación; su tiempo </w:t>
+      </w:r>
+      <w:r>
+        <w:rPr>
+          <w:rFonts w:asciiTheme="minorHAnsi" w:hAnsiTheme="minorHAnsi" w:cstheme="minorHAnsi"/>
+          <w:lang w:val="es-CO"/>
+        </w:rPr>
+        <w:lastRenderedPageBreak/>
+        <w:t>esperado lineal descansa precisamente en esa uniformidad (Cormen et al., 2022). Esa variante no sirve para este requerimiento, ya que introduciría comparaciones entre registros dentro de cada intervalo. La implementación es, por ello, una variante híbrida</w:t>
       </w:r>
       <w:r>
         <w:rPr>
@@ -5764,6 +5782,7 @@
           <w:rFonts w:asciiTheme="minorHAnsi" w:hAnsiTheme="minorHAnsi" w:cstheme="minorHAnsi"/>
           <w:lang w:val="es-CO"/>
         </w:rPr>
+        <w:lastRenderedPageBreak/>
         <w:t xml:space="preserve">Repartir cuesta </w:t>
       </w:r>
       <w:r>
@@ -7704,7 +7723,15 @@
           <w:rFonts w:asciiTheme="minorHAnsi" w:hAnsiTheme="minorHAnsi" w:cstheme="minorHAnsi"/>
           <w:lang w:val="es-CO"/>
         </w:rPr>
-        <w:t>Asimismo, el experimento se repitió en tres procesos independientes de la máquina virtual, rotando el orden de los algoritmos para no favorecer a ninguno: counting, radix, bucket en el primero; radix, bucket, counting en el segundo; y bucket, counting, radix en el tercero. En cada corrida la salida completa se comparó con la primera, y las 900 salidas medidas coincidieron. La medición se realizó en un procesador Intel Core i9-12900H con Java 25, sin aislar la máquina de otras tareas. La Tabla 6 presenta la mediana, el mínimo y el máximo de cada algoritmo, y la Figura 1 representa las medianas.</w:t>
+        <w:t xml:space="preserve">Asimismo, el experimento se repitió en tres procesos independientes de la máquina virtual, rotando el orden de los algoritmos para no favorecer a ninguno: counting, radix, bucket en el primero; </w:t>
+      </w:r>
+      <w:r>
+        <w:rPr>
+          <w:rFonts w:asciiTheme="minorHAnsi" w:hAnsiTheme="minorHAnsi" w:cstheme="minorHAnsi"/>
+          <w:lang w:val="es-CO"/>
+        </w:rPr>
+        <w:lastRenderedPageBreak/>
+        <w:t>radix, bucket, counting en el segundo; y bucket, counting, radix en el tercero. En cada corrida la salida completa se comparó con la primera, y las 900 salidas medidas coincidieron. La medición se realizó en un procesador Intel Core i9-12900H con Java 25, sin aislar la máquina de otras tareas. La Tabla 6 presenta la mediana, el mínimo y el máximo de cada algoritmo, y la Figura 1 representa las medianas.</w:t>
       </w:r>
     </w:p>
     <w:p>
@@ -9475,6 +9502,7 @@
           <w:szCs w:val="22"/>
           <w:lang w:val="es-ES"/>
         </w:rPr>
+        <w:lastRenderedPageBreak/>
         <w:t xml:space="preserve">Figura </w:t>
       </w:r>
       <w:r>
@@ -9752,6 +9780,7 @@
           <w:szCs w:val="22"/>
           <w:lang w:val="es-ES"/>
         </w:rPr>
+        <w:lastRenderedPageBreak/>
         <w:t xml:space="preserve">Tabla </w:t>
       </w:r>
       <w:r>
@@ -12977,6 +13006,7 @@
       <w:bookmarkStart w:id="20" w:name="_Toc900112"/>
       <w:bookmarkStart w:id="21" w:name="_Toc243434746"/>
       <w:r>
+        <w:lastRenderedPageBreak/>
         <w:t>Referencias</w:t>
       </w:r>
       <w:bookmarkEnd w:id="20"/>
@@ -13076,6 +13106,7 @@
         <w:rPr>
           <w:lang w:val="es-CO"/>
         </w:rPr>
+        <w:lastRenderedPageBreak/>
         <w:t>Anexo A. Repositorio y código fuente</w:t>
       </w:r>
       <w:bookmarkEnd w:id="22"/>

</xml_diff>

<commit_message>
docs(ranking): update the measurement in the ranking report
</commit_message>
<xml_diff>
--- a/docs/Ranking de Términos Mediante Algoritmos de Ordenamiento no Comparativos.docx
+++ b/docs/Ranking de Términos Mediante Algoritmos de Ordenamiento no Comparativos.docx
@@ -8080,7 +8080,7 @@
                 <w:szCs w:val="20"/>
                 <w:lang w:val="es-CO"/>
               </w:rPr>
-              <w:t>0,066199</w:t>
+              <w:t>0,020916</w:t>
             </w:r>
           </w:p>
         </w:tc>
@@ -8103,7 +8103,7 @@
                 <w:szCs w:val="20"/>
                 <w:lang w:val="es-CO"/>
               </w:rPr>
-              <w:t>0,034503</w:t>
+              <w:t>0,017206</w:t>
             </w:r>
           </w:p>
         </w:tc>
@@ -8126,7 +8126,7 @@
                 <w:szCs w:val="20"/>
                 <w:lang w:val="es-CO"/>
               </w:rPr>
-              <w:t>0,274811</w:t>
+              <w:t>0,167342</w:t>
             </w:r>
           </w:p>
         </w:tc>
@@ -8199,7 +8199,7 @@
                 <w:szCs w:val="20"/>
                 <w:lang w:val="es-CO"/>
               </w:rPr>
-              <w:t>0,102153</w:t>
+              <w:t>0,059807</w:t>
             </w:r>
           </w:p>
         </w:tc>
@@ -8222,7 +8222,7 @@
                 <w:szCs w:val="20"/>
                 <w:lang w:val="es-CO"/>
               </w:rPr>
-              <w:t>0,044434</w:t>
+              <w:t>0,023738</w:t>
             </w:r>
           </w:p>
         </w:tc>
@@ -8245,7 +8245,7 @@
                 <w:szCs w:val="20"/>
                 <w:lang w:val="es-CO"/>
               </w:rPr>
-              <w:t>3,892686</w:t>
+              <w:t>0,209487</w:t>
             </w:r>
           </w:p>
         </w:tc>
@@ -8318,7 +8318,7 @@
                 <w:szCs w:val="20"/>
                 <w:lang w:val="es-CO"/>
               </w:rPr>
-              <w:t>0,079588</w:t>
+              <w:t>0,044462</w:t>
             </w:r>
           </w:p>
         </w:tc>
@@ -8341,7 +8341,7 @@
                 <w:szCs w:val="20"/>
                 <w:lang w:val="es-CO"/>
               </w:rPr>
-              <w:t>0,057832</w:t>
+              <w:t>0,038034</w:t>
             </w:r>
           </w:p>
         </w:tc>
@@ -8364,7 +8364,7 @@
                 <w:szCs w:val="20"/>
                 <w:lang w:val="es-CO"/>
               </w:rPr>
-              <w:t>0,335151</w:t>
+              <w:t>0,294702</w:t>
             </w:r>
           </w:p>
         </w:tc>
@@ -8437,7 +8437,7 @@
                 <w:szCs w:val="20"/>
                 <w:lang w:val="es-CO"/>
               </w:rPr>
-              <w:t>0,047255</w:t>
+              <w:t>0,020829</w:t>
             </w:r>
           </w:p>
         </w:tc>
@@ -8460,7 +8460,7 @@
                 <w:szCs w:val="20"/>
                 <w:lang w:val="es-CO"/>
               </w:rPr>
-              <w:t>0,033887</w:t>
+              <w:t>0,019815</w:t>
             </w:r>
           </w:p>
         </w:tc>
@@ -8483,7 +8483,7 @@
                 <w:szCs w:val="20"/>
                 <w:lang w:val="es-CO"/>
               </w:rPr>
-              <w:t>0,366297</w:t>
+              <w:t>0,184307</w:t>
             </w:r>
           </w:p>
         </w:tc>
@@ -8556,7 +8556,7 @@
                 <w:szCs w:val="20"/>
                 <w:lang w:val="es-CO"/>
               </w:rPr>
-              <w:t>0,069436</w:t>
+              <w:t>0,038697</w:t>
             </w:r>
           </w:p>
         </w:tc>
@@ -8579,7 +8579,7 @@
                 <w:szCs w:val="20"/>
                 <w:lang w:val="es-CO"/>
               </w:rPr>
-              <w:t>0,046429</w:t>
+              <w:t>0,023211</w:t>
             </w:r>
           </w:p>
         </w:tc>
@@ -8602,7 +8602,7 @@
                 <w:szCs w:val="20"/>
                 <w:lang w:val="es-CO"/>
               </w:rPr>
-              <w:t>0,377221</w:t>
+              <w:t>0,175196</w:t>
             </w:r>
           </w:p>
         </w:tc>
@@ -8675,7 +8675,7 @@
                 <w:szCs w:val="20"/>
                 <w:lang w:val="es-CO"/>
               </w:rPr>
-              <w:t>0,124493</w:t>
+              <w:t>0,048128</w:t>
             </w:r>
           </w:p>
         </w:tc>
@@ -8698,7 +8698,7 @@
                 <w:szCs w:val="20"/>
                 <w:lang w:val="es-CO"/>
               </w:rPr>
-              <w:t>0,059197</w:t>
+              <w:t>0,040123</w:t>
             </w:r>
           </w:p>
         </w:tc>
@@ -8721,7 +8721,7 @@
                 <w:szCs w:val="20"/>
                 <w:lang w:val="es-CO"/>
               </w:rPr>
-              <w:t>5,217948</w:t>
+              <w:t>0,263709</w:t>
             </w:r>
           </w:p>
         </w:tc>
@@ -8794,7 +8794,7 @@
                 <w:szCs w:val="20"/>
                 <w:lang w:val="es-CO"/>
               </w:rPr>
-              <w:t>0,041851</w:t>
+              <w:t>0,023806</w:t>
             </w:r>
           </w:p>
         </w:tc>
@@ -8817,7 +8817,7 @@
                 <w:szCs w:val="20"/>
                 <w:lang w:val="es-CO"/>
               </w:rPr>
-              <w:t>0,031889</w:t>
+              <w:t>0,019654</w:t>
             </w:r>
           </w:p>
         </w:tc>
@@ -8840,7 +8840,7 @@
                 <w:szCs w:val="20"/>
                 <w:lang w:val="es-CO"/>
               </w:rPr>
-              <w:t>4,591844</w:t>
+              <w:t>0,223586</w:t>
             </w:r>
           </w:p>
         </w:tc>
@@ -8913,7 +8913,7 @@
                 <w:szCs w:val="20"/>
                 <w:lang w:val="es-CO"/>
               </w:rPr>
-              <w:t>0,116887</w:t>
+              <w:t>0,086176</w:t>
             </w:r>
           </w:p>
         </w:tc>
@@ -8936,7 +8936,7 @@
                 <w:szCs w:val="20"/>
                 <w:lang w:val="es-CO"/>
               </w:rPr>
-              <w:t>0,042160</w:t>
+              <w:t>0,047053</w:t>
             </w:r>
           </w:p>
         </w:tc>
@@ -8959,7 +8959,7 @@
                 <w:szCs w:val="20"/>
                 <w:lang w:val="es-CO"/>
               </w:rPr>
-              <w:t>0,297304</w:t>
+              <w:t>0,255909</w:t>
             </w:r>
           </w:p>
         </w:tc>
@@ -9032,7 +9032,7 @@
                 <w:szCs w:val="20"/>
                 <w:lang w:val="es-CO"/>
               </w:rPr>
-              <w:t>0,177821</w:t>
+              <w:t>0,046369</w:t>
             </w:r>
           </w:p>
         </w:tc>
@@ -9055,7 +9055,7 @@
                 <w:szCs w:val="20"/>
                 <w:lang w:val="es-CO"/>
               </w:rPr>
-              <w:t>0,063758</w:t>
+              <w:t>0,036185</w:t>
             </w:r>
           </w:p>
         </w:tc>
@@ -9078,7 +9078,7 @@
                 <w:szCs w:val="20"/>
                 <w:lang w:val="es-CO"/>
               </w:rPr>
-              <w:t>0,403166</w:t>
+              <w:t>0,246186</w:t>
             </w:r>
           </w:p>
         </w:tc>
@@ -9151,7 +9151,7 @@
                 <w:szCs w:val="20"/>
                 <w:lang w:val="es-CO"/>
               </w:rPr>
-              <w:t>0,052687</w:t>
+              <w:t>0,021845</w:t>
             </w:r>
           </w:p>
         </w:tc>
@@ -9174,7 +9174,7 @@
                 <w:szCs w:val="20"/>
                 <w:lang w:val="es-CO"/>
               </w:rPr>
-              <w:t>0,031889</w:t>
+              <w:t>0,017206</w:t>
             </w:r>
           </w:p>
         </w:tc>
@@ -9197,7 +9197,7 @@
                 <w:szCs w:val="20"/>
                 <w:lang w:val="es-CO"/>
               </w:rPr>
-              <w:t>4,591844</w:t>
+              <w:t>0,223586</w:t>
             </w:r>
           </w:p>
         </w:tc>
@@ -9270,7 +9270,7 @@
                 <w:szCs w:val="20"/>
                 <w:lang w:val="es-CO"/>
               </w:rPr>
-              <w:t>0,100938</w:t>
+              <w:t>0,079083</w:t>
             </w:r>
           </w:p>
         </w:tc>
@@ -9293,7 +9293,7 @@
                 <w:szCs w:val="20"/>
                 <w:lang w:val="es-CO"/>
               </w:rPr>
-              <w:t>0,042160</w:t>
+              <w:t>0,023211</w:t>
             </w:r>
           </w:p>
         </w:tc>
@@ -9316,7 +9316,7 @@
                 <w:szCs w:val="20"/>
                 <w:lang w:val="es-CO"/>
               </w:rPr>
-              <w:t>3,892686</w:t>
+              <w:t>0,255909</w:t>
             </w:r>
           </w:p>
         </w:tc>
@@ -9395,7 +9395,7 @@
                 <w:szCs w:val="20"/>
                 <w:lang w:val="es-CO"/>
               </w:rPr>
-              <w:t>0,163552</w:t>
+              <w:t>0,046460</w:t>
             </w:r>
           </w:p>
         </w:tc>
@@ -9420,7 +9420,7 @@
                 <w:szCs w:val="20"/>
                 <w:lang w:val="es-CO"/>
               </w:rPr>
-              <w:t>0,057832</w:t>
+              <w:t>0,036185</w:t>
             </w:r>
           </w:p>
         </w:tc>
@@ -9445,7 +9445,7 @@
                 <w:szCs w:val="20"/>
                 <w:lang w:val="es-CO"/>
               </w:rPr>
-              <w:t>5,217948</w:t>
+              <w:t>0,294702</w:t>
             </w:r>
           </w:p>
         </w:tc>
@@ -9692,7 +9692,7 @@
           <w:rFonts w:asciiTheme="minorHAnsi" w:hAnsiTheme="minorHAnsi" w:cstheme="minorHAnsi"/>
           <w:lang w:val="es-CO"/>
         </w:rPr>
-        <w:t>Los tiempos son fracciones de milisegundo, ya que se ordenan en memoria únicamente 1.079 registros. Counting Sort obtuvo la mediana de conjunto más baja, 0,052687 ms, frente a 0,100938 ms de Radix y 0,163552 ms de Bucket, un orden compatible con el número de recorridos que cada algoritmo hace sobre este corpus. No obstante, las medianas por proceso muestran que ese orden no es estable: en el proceso 1, Bucket (0,079588 ms) fue más rápido que Radix (0,102153 ms), mientras que en el proceso 3 registró la mediana más alta del experimento. Dicho de otro modo, a esta escala la posición dentro de la rotación y el estado de la máquina virtual pesan tanto como el algoritmo.</w:t>
+        <w:t>Los tiempos son fracciones de milisegundo, ya que se ordenan en memoria únicamente 1.079 registros. Counting Sort obtuvo la mediana de conjunto más baja, 0,021845 ms, frente a 0,046460 ms de Bucket y 0,079083 ms de Radix, un orden compatible con el número de recorridos que cada algoritmo hace sobre este corpus. No obstante, las medianas por proceso muestran que ese orden no es estable: en el proceso 2, Radix (0,038697 ms) fue más rápido que Bucket (0,048128 ms), mientras que en el proceso 3 registró la mediana más alta del experimento (0,086176 ms). Dicho de otro modo, a esta escala la posición dentro de la rotación y el estado de la máquina virtual pesan tanto como el algoritmo.</w:t>
       </w:r>
     </w:p>
     <w:p>
@@ -9708,7 +9708,7 @@
           <w:rFonts w:asciiTheme="minorHAnsi" w:hAnsiTheme="minorHAnsi" w:cstheme="minorHAnsi"/>
           <w:lang w:val="es-CO"/>
         </w:rPr>
-        <w:t>Los máximos, entre 3 y 5 ms en tres casos, son valores atípicos compatibles con interrupciones del sistema operativo, recolección de basura o compilación en caliente. Por consiguiente, la medición sostiene que los tres algoritmos ordenan la lista completa del corpus en una fracción de milisegundo, y que Counting Sort presentó la mediana más baja en esta ejecución; no sostiene una clasificación general de los algoritmos ni una extrapolación a corpus más grandes.</w:t>
+        <w:t>Los máximos, de hasta 0,29 ms, son valores atípicos compatibles con interrupciones del sistema operativo, recolección de basura o compilación en caliente. Por consiguiente, la medición sostiene que los tres algoritmos ordenan la lista completa del corpus en una fracción de milisegundo, y que Counting Sort presentó la mediana más baja en esta ejecución; no sostiene una clasificación general de los algoritmos ni una extrapolación a corpus más grandes.</w:t>
       </w:r>
     </w:p>
     <w:p>

</xml_diff>